<commit_message>
Product Service Changes 31/05
</commit_message>
<xml_diff>
--- a/Important Notes.docx
+++ b/Important Notes.docx
@@ -3,138 +3,30 @@
 <w:document xmlns:wpc="http://schemas.microsoft.com/office/word/2010/wordprocessingCanvas" xmlns:cx="http://schemas.microsoft.com/office/drawing/2014/chartex" xmlns:cx1="http://schemas.microsoft.com/office/drawing/2015/9/8/chartex" xmlns:cx2="http://schemas.microsoft.com/office/drawing/2015/10/21/chartex" xmlns:cx3="http://schemas.microsoft.com/office/drawing/2016/5/9/chartex" xmlns:cx4="http://schemas.microsoft.com/office/drawing/2016/5/10/chartex" xmlns:cx5="http://schemas.microsoft.com/office/drawing/2016/5/11/chartex" xmlns:cx6="http://schemas.microsoft.com/office/drawing/2016/5/12/chartex" xmlns:cx7="http://schemas.microsoft.com/office/drawing/2016/5/13/chartex" xmlns:cx8="http://schemas.microsoft.com/office/drawing/2016/5/14/chartex" xmlns:mc="http://schemas.openxmlformats.org/markup-compatibility/2006" xmlns:aink="http://schemas.microsoft.com/office/drawing/2016/ink" xmlns:am3d="http://schemas.microsoft.com/office/drawing/2017/model3d" xmlns:o="urn:schemas-microsoft-com:office:office" xmlns:oel="http://schemas.microsoft.com/office/2019/extlst" xmlns:r="http://schemas.openxmlformats.org/officeDocument/2006/relationships" xmlns:m="http://schemas.openxmlformats.org/officeDocument/2006/math" xmlns:v="urn:schemas-microsoft-com:vml" xmlns:wp14="http://schemas.microsoft.com/office/word/2010/wordprocessingDrawing" xmlns:wp="http://schemas.openxmlformats.org/drawingml/2006/wordprocessingDrawing" xmlns:w10="urn:schemas-microsoft-com:office:word" xmlns:w="http://schemas.openxmlformats.org/wordprocessingml/2006/main" xmlns:w14="http://schemas.microsoft.com/office/word/2010/wordml" xmlns:w15="http://schemas.microsoft.com/office/word/2012/wordml" xmlns:w16cex="http://schemas.microsoft.com/office/word/2018/wordml/cex" xmlns:w16cid="http://schemas.microsoft.com/office/word/2016/wordml/cid" xmlns:w16="http://schemas.microsoft.com/office/word/2018/wordml" xmlns:w16du="http://schemas.microsoft.com/office/word/2023/wordml/word16du" xmlns:w16sdtdh="http://schemas.microsoft.com/office/word/2020/wordml/sdtdatahash" xmlns:w16sdtfl="http://schemas.microsoft.com/office/word/2024/wordml/sdtformatlock" xmlns:w16se="http://schemas.microsoft.com/office/word/2015/wordml/symex" xmlns:wpg="http://schemas.microsoft.com/office/word/2010/wordprocessingGroup" xmlns:wpi="http://schemas.microsoft.com/office/word/2010/wordprocessingInk" xmlns:wne="http://schemas.microsoft.com/office/word/2006/wordml" xmlns:wps="http://schemas.microsoft.com/office/word/2010/wordprocessingShape" mc:Ignorable="w14 w15 w16se w16cid w16 w16cex w16sdtdh w16sdtfl w16du wp14">
   <w:body>
     <w:p>
-      <w:proofErr w:type="spellStart"/>
-      <w:proofErr w:type="gramStart"/>
-      <w:r>
-        <w:t>Node,js</w:t>
-      </w:r>
-      <w:proofErr w:type="spellEnd"/>
-      <w:proofErr w:type="gramEnd"/>
-      <w:r>
-        <w:t xml:space="preserve"> is having Winston for logging </w:t>
-      </w:r>
-    </w:p>
-    <w:p>
-      <w:r>
-        <w:t xml:space="preserve">Java spring boot </w:t>
-      </w:r>
-      <w:proofErr w:type="gramStart"/>
-      <w:r>
-        <w:t>have</w:t>
-      </w:r>
-      <w:proofErr w:type="gramEnd"/>
-      <w:r>
-        <w:t xml:space="preserve"> Log4j2 for logging</w:t>
+      <w:r>
+        <w:t xml:space="preserve">Node,js is having Winston for logging </w:t>
+      </w:r>
+    </w:p>
+    <w:p>
+      <w:r>
+        <w:t>Java spring boot have Log4j2 for logging</w:t>
       </w:r>
     </w:p>
     <w:p/>
     <w:p>
       <w:r>
-        <w:t xml:space="preserve">JavaScript </w:t>
-      </w:r>
-      <w:proofErr w:type="gramStart"/>
-      <w:r>
-        <w:t>Lambda(</w:t>
-      </w:r>
-      <w:proofErr w:type="gramEnd"/>
-      <w:r>
-        <w:t xml:space="preserve">arrow </w:t>
-      </w:r>
-      <w:proofErr w:type="gramStart"/>
-      <w:r>
-        <w:t>function)  →</w:t>
-      </w:r>
-      <w:proofErr w:type="gramEnd"/>
-      <w:r>
-        <w:t xml:space="preserve">  x =&gt; x &gt; 1</w:t>
-      </w:r>
-    </w:p>
-    <w:p>
-      <w:r>
-        <w:t xml:space="preserve">Java   Lambada     </w:t>
-      </w:r>
-      <w:proofErr w:type="gramStart"/>
-      <w:r>
-        <w:t>→  x</w:t>
-      </w:r>
-      <w:proofErr w:type="gramEnd"/>
-      <w:r>
-        <w:t xml:space="preserve"> -&gt; x &gt; 1</w:t>
+        <w:t>JavaScript Lambda(arrow function)  →  x =&gt; x &gt; 1</w:t>
+      </w:r>
+    </w:p>
+    <w:p>
+      <w:r>
+        <w:t>Java   Lambada     →  x -&gt; x &gt; 1</w:t>
       </w:r>
     </w:p>
     <w:p/>
     <w:p>
-      <w:proofErr w:type="spellStart"/>
-      <w:r>
-        <w:t>JavaScriptJavaarray.filter</w:t>
-      </w:r>
-      <w:proofErr w:type="spellEnd"/>
-      <w:r>
-        <w:t>(x =&gt; )stream().filter(x -&gt; )</w:t>
-      </w:r>
-      <w:proofErr w:type="spellStart"/>
-      <w:r>
-        <w:t>array.map</w:t>
-      </w:r>
-      <w:proofErr w:type="spellEnd"/>
-      <w:r>
-        <w:t>(x =&gt; )stream().map(x -&gt; )</w:t>
-      </w:r>
-      <w:proofErr w:type="spellStart"/>
-      <w:r>
-        <w:t>array.find</w:t>
-      </w:r>
-      <w:proofErr w:type="spellEnd"/>
-      <w:r>
-        <w:t>(x =&gt; )stream().filter().</w:t>
-      </w:r>
-      <w:proofErr w:type="spellStart"/>
-      <w:r>
-        <w:t>findFirst</w:t>
-      </w:r>
-      <w:proofErr w:type="spellEnd"/>
-      <w:r>
-        <w:t>()</w:t>
-      </w:r>
-      <w:proofErr w:type="spellStart"/>
-      <w:r>
-        <w:t>array.some</w:t>
-      </w:r>
-      <w:proofErr w:type="spellEnd"/>
-      <w:r>
-        <w:t>(x =&gt; )stream().</w:t>
-      </w:r>
-      <w:proofErr w:type="spellStart"/>
-      <w:r>
-        <w:t>anyMatch</w:t>
-      </w:r>
-      <w:proofErr w:type="spellEnd"/>
-      <w:r>
-        <w:t>(x -&gt; )</w:t>
-      </w:r>
-      <w:proofErr w:type="spellStart"/>
-      <w:r>
-        <w:t>array.every</w:t>
-      </w:r>
-      <w:proofErr w:type="spellEnd"/>
-      <w:r>
-        <w:t>(x =&gt; )stream().</w:t>
-      </w:r>
-      <w:proofErr w:type="spellStart"/>
-      <w:r>
-        <w:t>allMatch</w:t>
-      </w:r>
-      <w:proofErr w:type="spellEnd"/>
-      <w:r>
-        <w:t xml:space="preserve">(x -&gt; )array.reduce()stream().reduce()array.sort()stream().sorted()array.lengthstream().count()No </w:t>
-      </w:r>
-      <w:proofErr w:type="spellStart"/>
-      <w:r>
-        <w:t>equivalentstream</w:t>
-      </w:r>
-      <w:proofErr w:type="spellEnd"/>
-      <w:r>
-        <w:t>().collect()</w:t>
+      <w:r>
+        <w:t>JavaScriptJavaarray.filter(x =&gt; )stream().filter(x -&gt; )array.map(x =&gt; )stream().map(x -&gt; )array.find(x =&gt; )stream().filter().findFirst()array.some(x =&gt; )stream().anyMatch(x -&gt; )array.every(x =&gt; )stream().allMatch(x -&gt; )array.reduce()stream().reduce()array.sort()stream().sorted()array.lengthstream().count()No equivalentstream().collect()</w:t>
       </w:r>
     </w:p>
     <w:p/>
@@ -156,15 +48,7 @@
         <w:t>annotation</w:t>
       </w:r>
       <w:r>
-        <w:t xml:space="preserve"> is a label you put on a class, method, or field to give it special meaning or </w:t>
-      </w:r>
-      <w:proofErr w:type="spellStart"/>
-      <w:r>
-        <w:t>behavior</w:t>
-      </w:r>
-      <w:proofErr w:type="spellEnd"/>
-      <w:r>
-        <w:t>.</w:t>
+        <w:t xml:space="preserve"> is a label you put on a class, method, or field to give it special meaning or behavior.</w:t>
       </w:r>
     </w:p>
     <w:p>
@@ -213,13 +97,8 @@
         </w:rPr>
         <w:br/>
       </w:r>
-      <w:proofErr w:type="gramStart"/>
-      <w:r>
-        <w:t>  Marks</w:t>
-      </w:r>
-      <w:proofErr w:type="gramEnd"/>
-      <w:r>
-        <w:t xml:space="preserve"> the </w:t>
+      <w:r>
+        <w:t xml:space="preserve">  Marks the </w:t>
       </w:r>
       <w:r>
         <w:rPr>
@@ -233,13 +112,8 @@
       </w:r>
     </w:p>
     <w:p>
-      <w:proofErr w:type="gramStart"/>
-      <w:r>
-        <w:t>  Combines</w:t>
-      </w:r>
-      <w:proofErr w:type="gramEnd"/>
-      <w:r>
-        <w:t xml:space="preserve"> three annotations in one — </w:t>
+      <w:r>
+        <w:t xml:space="preserve">  Combines three annotations in one — </w:t>
       </w:r>
     </w:p>
     <w:p>
@@ -310,15 +184,7 @@
     </w:p>
     <w:p>
       <w:r>
-        <w:t xml:space="preserve">public class </w:t>
-      </w:r>
-      <w:proofErr w:type="spellStart"/>
-      <w:r>
-        <w:t>ProductService</w:t>
-      </w:r>
-      <w:proofErr w:type="spellEnd"/>
-      <w:r>
-        <w:t xml:space="preserve"> {</w:t>
+        <w:t>public class ProductService {</w:t>
       </w:r>
     </w:p>
     <w:p>
@@ -375,21 +241,12 @@
       <w:r>
         <w:br/>
       </w:r>
-      <w:proofErr w:type="spellStart"/>
-      <w:r>
-        <w:rPr>
-          <w:b/>
-          <w:bCs/>
-        </w:rPr>
-        <w:t>NestJS</w:t>
-      </w:r>
-      <w:proofErr w:type="spellEnd"/>
-      <w:r>
-        <w:rPr>
-          <w:b/>
-          <w:bCs/>
-        </w:rPr>
-        <w:t xml:space="preserve"> equivalent —</w:t>
+      <w:r>
+        <w:rPr>
+          <w:b/>
+          <w:bCs/>
+        </w:rPr>
+        <w:t>NestJS equivalent —</w:t>
       </w:r>
     </w:p>
     <w:p>
@@ -419,23 +276,7 @@
           <w:b/>
           <w:bCs/>
         </w:rPr>
-        <w:t>@</w:t>
-      </w:r>
-      <w:proofErr w:type="gramStart"/>
-      <w:r>
-        <w:rPr>
-          <w:b/>
-          <w:bCs/>
-        </w:rPr>
-        <w:t>Injectable(</w:t>
-      </w:r>
-      <w:proofErr w:type="gramEnd"/>
-      <w:r>
-        <w:rPr>
-          <w:b/>
-          <w:bCs/>
-        </w:rPr>
-        <w:t>)</w:t>
+        <w:t>@Injectable()</w:t>
       </w:r>
     </w:p>
     <w:p>
@@ -446,281 +287,277 @@
         </w:numPr>
       </w:pPr>
       <w:r>
-        <w:t xml:space="preserve">export class </w:t>
-      </w:r>
-      <w:proofErr w:type="spellStart"/>
-      <w:r>
-        <w:t>ProductService</w:t>
-      </w:r>
-      <w:proofErr w:type="spellEnd"/>
+        <w:t>export class ProductService { }</w:t>
+      </w:r>
+    </w:p>
+    <w:p>
+      <w:pPr>
+        <w:rPr>
+          <w:b/>
+          <w:bCs/>
+        </w:rPr>
+      </w:pPr>
+      <w:r>
+        <w:rPr>
+          <w:b/>
+          <w:bCs/>
+        </w:rPr>
+        <w:t xml:space="preserve">Java entity </w:t>
+      </w:r>
+      <w:r>
+        <w:rPr>
+          <w:b/>
+          <w:bCs/>
+        </w:rPr>
+        <w:t>@Entity @Table(name = "products")</w:t>
+      </w:r>
+    </w:p>
+    <w:p>
+      <w:pPr>
+        <w:rPr>
+          <w:b/>
+          <w:bCs/>
+        </w:rPr>
+      </w:pPr>
+      <w:r>
+        <w:rPr>
+          <w:b/>
+          <w:bCs/>
+        </w:rPr>
+        <w:t xml:space="preserve">NestJS entity </w:t>
+      </w:r>
+      <w:r>
+        <w:rPr>
+          <w:b/>
+          <w:bCs/>
+        </w:rPr>
+        <w:t>@Entity('products')</w:t>
+      </w:r>
+    </w:p>
+    <w:p>
+      <w:pPr>
+        <w:rPr>
+          <w:b/>
+          <w:bCs/>
+        </w:rPr>
+      </w:pPr>
+    </w:p>
+    <w:p>
+      <w:pPr>
+        <w:rPr>
+          <w:b/>
+          <w:bCs/>
+        </w:rPr>
+      </w:pPr>
+      <w:r>
+        <w:rPr>
+          <w:b/>
+          <w:bCs/>
+        </w:rPr>
+        <w:t>Request Mapping Annotations</w:t>
+      </w:r>
+    </w:p>
+    <w:p>
+      <w:pPr>
+        <w:rPr>
+          <w:b/>
+          <w:bCs/>
+        </w:rPr>
+      </w:pPr>
+      <w:r>
+        <w:rPr>
+          <w:b/>
+          <w:bCs/>
+        </w:rPr>
+        <w:t>java</w:t>
+      </w:r>
+    </w:p>
+    <w:p>
+      <w:r>
+        <w:t>@GetMapping("/products")          // GET request</w:t>
+      </w:r>
+    </w:p>
+    <w:p>
+      <w:r>
+        <w:t>@PostMapping("/products")         // POST request</w:t>
+      </w:r>
+    </w:p>
+    <w:p>
+      <w:r>
+        <w:t>@PutMapping("/products/{id}")     // PUT request</w:t>
+      </w:r>
+    </w:p>
+    <w:p>
+      <w:r>
+        <w:t>@PatchMapping("/products/{id}")   // PATCH request</w:t>
+      </w:r>
+    </w:p>
+    <w:p>
+      <w:r>
+        <w:t>@DeleteMapping("/products/{id}")  // DELETE request</w:t>
+      </w:r>
+    </w:p>
+    <w:p>
+      <w:pPr>
+        <w:rPr>
+          <w:b/>
+          <w:bCs/>
+        </w:rPr>
+      </w:pPr>
+      <w:r>
+        <w:rPr>
+          <w:b/>
+          <w:bCs/>
+        </w:rPr>
+        <w:t>NestJS equivalent —</w:t>
+      </w:r>
+    </w:p>
+    <w:p>
+      <w:pPr>
+        <w:rPr>
+          <w:b/>
+          <w:bCs/>
+        </w:rPr>
+      </w:pPr>
+      <w:r>
+        <w:rPr>
+          <w:b/>
+          <w:bCs/>
+        </w:rPr>
+        <w:t>typescript</w:t>
+      </w:r>
+    </w:p>
+    <w:p>
+      <w:r>
+        <w:t>@Get('/products')</w:t>
+      </w:r>
+    </w:p>
+    <w:p>
+      <w:r>
+        <w:t>@Post('/products')</w:t>
+      </w:r>
+    </w:p>
+    <w:p>
+      <w:r>
+        <w:t>@Put('/products/:id')</w:t>
+      </w:r>
+    </w:p>
+    <w:p>
+      <w:r>
+        <w:t>@Patch('/products/:id')</w:t>
+      </w:r>
+    </w:p>
+    <w:p>
+      <w:r>
+        <w:t>@Delete('/products/:id')</w:t>
+      </w:r>
+    </w:p>
+    <w:p>
+      <w:pPr>
+        <w:rPr>
+          <w:b/>
+          <w:bCs/>
+        </w:rPr>
+      </w:pPr>
+    </w:p>
+    <w:p/>
+    <w:p>
+      <w:pPr>
+        <w:rPr>
+          <w:b/>
+          <w:bCs/>
+        </w:rPr>
+      </w:pPr>
+      <w:r>
+        <w:rPr>
+          <w:b/>
+          <w:bCs/>
+        </w:rPr>
+        <w:t>@Bean</w:t>
+      </w:r>
       <w:r>
         <w:t xml:space="preserve"> </w:t>
       </w:r>
-      <w:proofErr w:type="gramStart"/>
-      <w:r>
-        <w:t>{ }</w:t>
-      </w:r>
-      <w:proofErr w:type="gramEnd"/>
-    </w:p>
-    <w:p>
-      <w:pPr>
-        <w:rPr>
-          <w:b/>
-          <w:bCs/>
-        </w:rPr>
-      </w:pPr>
-      <w:r>
-        <w:rPr>
-          <w:b/>
-          <w:bCs/>
-        </w:rPr>
-        <w:t xml:space="preserve">Java entity </w:t>
-      </w:r>
-      <w:r>
-        <w:rPr>
-          <w:b/>
-          <w:bCs/>
-        </w:rPr>
-        <w:t>@Entity @</w:t>
-      </w:r>
-      <w:proofErr w:type="gramStart"/>
-      <w:r>
-        <w:rPr>
-          <w:b/>
-          <w:bCs/>
-        </w:rPr>
-        <w:t>Table(</w:t>
-      </w:r>
-      <w:proofErr w:type="gramEnd"/>
-      <w:r>
-        <w:rPr>
-          <w:b/>
-          <w:bCs/>
-        </w:rPr>
-        <w:t>name = "products")</w:t>
-      </w:r>
-    </w:p>
-    <w:p>
-      <w:pPr>
-        <w:rPr>
-          <w:b/>
-          <w:bCs/>
-        </w:rPr>
-      </w:pPr>
-      <w:proofErr w:type="spellStart"/>
-      <w:r>
-        <w:rPr>
-          <w:b/>
-          <w:bCs/>
-        </w:rPr>
-        <w:t>NestJS</w:t>
-      </w:r>
-      <w:proofErr w:type="spellEnd"/>
-      <w:r>
-        <w:rPr>
-          <w:b/>
-          <w:bCs/>
-        </w:rPr>
-        <w:t xml:space="preserve"> entity </w:t>
-      </w:r>
-      <w:r>
-        <w:rPr>
-          <w:b/>
-          <w:bCs/>
-        </w:rPr>
-        <w:t>@Entity('products')</w:t>
-      </w:r>
-    </w:p>
-    <w:p>
-      <w:pPr>
-        <w:rPr>
-          <w:b/>
-          <w:bCs/>
-        </w:rPr>
-      </w:pPr>
-    </w:p>
-    <w:p>
-      <w:pPr>
-        <w:rPr>
-          <w:b/>
-          <w:bCs/>
-        </w:rPr>
-      </w:pPr>
-      <w:r>
-        <w:rPr>
-          <w:b/>
-          <w:bCs/>
-        </w:rPr>
-        <w:t>Request Mapping Annotations</w:t>
-      </w:r>
-    </w:p>
-    <w:p>
-      <w:pPr>
-        <w:rPr>
-          <w:b/>
-          <w:bCs/>
-        </w:rPr>
-      </w:pPr>
-      <w:r>
-        <w:rPr>
-          <w:b/>
-          <w:bCs/>
-        </w:rPr>
-        <w:t>java</w:t>
-      </w:r>
-    </w:p>
-    <w:p>
-      <w:r>
-        <w:t>@GetMapping("/products</w:t>
-      </w:r>
-      <w:proofErr w:type="gramStart"/>
-      <w:r>
-        <w:t xml:space="preserve">")   </w:t>
-      </w:r>
-      <w:proofErr w:type="gramEnd"/>
-      <w:r>
-        <w:t xml:space="preserve">       // GET request</w:t>
-      </w:r>
-    </w:p>
-    <w:p>
-      <w:r>
-        <w:t>@PostMapping("/products</w:t>
-      </w:r>
-      <w:proofErr w:type="gramStart"/>
-      <w:r>
-        <w:t xml:space="preserve">")   </w:t>
-      </w:r>
-      <w:proofErr w:type="gramEnd"/>
-      <w:r>
-        <w:t xml:space="preserve">      // POST request</w:t>
-      </w:r>
-    </w:p>
-    <w:p>
-      <w:r>
-        <w:t>@PutMapping("/products/{id}</w:t>
-      </w:r>
-      <w:proofErr w:type="gramStart"/>
-      <w:r>
-        <w:t xml:space="preserve">")   </w:t>
-      </w:r>
-      <w:proofErr w:type="gramEnd"/>
-      <w:r>
-        <w:t xml:space="preserve">  // PUT request</w:t>
-      </w:r>
-    </w:p>
-    <w:p>
-      <w:r>
-        <w:t>@PatchMapping("/products/{id}</w:t>
-      </w:r>
-      <w:proofErr w:type="gramStart"/>
-      <w:r>
-        <w:t xml:space="preserve">")   </w:t>
-      </w:r>
-      <w:proofErr w:type="gramEnd"/>
-      <w:r>
-        <w:t>// PATCH request</w:t>
-      </w:r>
-    </w:p>
-    <w:p>
-      <w:r>
-        <w:t>@DeleteMapping("/products/{id}</w:t>
-      </w:r>
-      <w:proofErr w:type="gramStart"/>
-      <w:r>
-        <w:t>")  /</w:t>
-      </w:r>
-      <w:proofErr w:type="gramEnd"/>
-      <w:r>
-        <w:t>/ DELETE request</w:t>
-      </w:r>
-    </w:p>
-    <w:p>
-      <w:pPr>
-        <w:rPr>
-          <w:b/>
-          <w:bCs/>
-        </w:rPr>
-      </w:pPr>
-      <w:proofErr w:type="spellStart"/>
-      <w:r>
-        <w:rPr>
-          <w:b/>
-          <w:bCs/>
-        </w:rPr>
-        <w:t>NestJS</w:t>
-      </w:r>
-      <w:proofErr w:type="spellEnd"/>
-      <w:r>
-        <w:rPr>
-          <w:b/>
-          <w:bCs/>
-        </w:rPr>
-        <w:t xml:space="preserve"> equivalent —</w:t>
-      </w:r>
-    </w:p>
-    <w:p>
-      <w:pPr>
-        <w:rPr>
-          <w:b/>
-          <w:bCs/>
-        </w:rPr>
-      </w:pPr>
-      <w:r>
-        <w:rPr>
-          <w:b/>
-          <w:bCs/>
-        </w:rPr>
-        <w:t>typescript</w:t>
-      </w:r>
-    </w:p>
-    <w:p>
-      <w:r>
-        <w:t>@Get('/</w:t>
-      </w:r>
-      <w:proofErr w:type="gramStart"/>
-      <w:r>
-        <w:t>products'</w:t>
-      </w:r>
-      <w:proofErr w:type="gramEnd"/>
-      <w:r>
-        <w:t>)</w:t>
-      </w:r>
-    </w:p>
-    <w:p>
-      <w:r>
-        <w:t>@Post('/</w:t>
-      </w:r>
-      <w:proofErr w:type="gramStart"/>
-      <w:r>
-        <w:t>products'</w:t>
-      </w:r>
-      <w:proofErr w:type="gramEnd"/>
-      <w:r>
-        <w:t>)</w:t>
-      </w:r>
-    </w:p>
-    <w:p>
-      <w:r>
-        <w:t>@Put('/products/:id')</w:t>
-      </w:r>
-    </w:p>
-    <w:p>
-      <w:r>
-        <w:t>@Patch('/products/:id')</w:t>
-      </w:r>
-    </w:p>
-    <w:p>
-      <w:r>
-        <w:t>@Delete('/products/:id')</w:t>
-      </w:r>
-    </w:p>
-    <w:p>
-      <w:pPr>
-        <w:rPr>
-          <w:b/>
-          <w:bCs/>
-        </w:rPr>
-      </w:pPr>
+      <w:r>
+        <w:t xml:space="preserve">Creates a </w:t>
+      </w:r>
+      <w:r>
+        <w:rPr>
+          <w:b/>
+          <w:bCs/>
+        </w:rPr>
+        <w:t>Spring managed object</w:t>
+      </w:r>
+    </w:p>
+    <w:p>
+      <w:pPr>
+        <w:rPr>
+          <w:b/>
+          <w:bCs/>
+        </w:rPr>
+      </w:pPr>
+    </w:p>
+    <w:p>
+      <w:r>
+        <w:rPr>
+          <w:b/>
+          <w:bCs/>
+        </w:rPr>
+        <w:t>@Transactional</w:t>
+      </w:r>
+      <w:r>
+        <w:t xml:space="preserve"> </w:t>
+      </w:r>
+    </w:p>
+    <w:p>
+      <w:r>
+        <w:t xml:space="preserve">public Order placeOrder(OrderDto dto) { </w:t>
+      </w:r>
+    </w:p>
+    <w:p>
+      <w:pPr>
+        <w:rPr>
+          <w:b/>
+          <w:bCs/>
+        </w:rPr>
+      </w:pPr>
+      <w:r>
+        <w:rPr>
+          <w:b/>
+          <w:bCs/>
+        </w:rPr>
+        <w:t xml:space="preserve">// All DB operations here run in one transaction </w:t>
+      </w:r>
+    </w:p>
+    <w:p>
+      <w:pPr>
+        <w:rPr>
+          <w:b/>
+          <w:bCs/>
+        </w:rPr>
+      </w:pPr>
+      <w:r>
+        <w:rPr>
+          <w:b/>
+          <w:bCs/>
+        </w:rPr>
+        <w:t xml:space="preserve">// If anything fails — ALL changes rolled back </w:t>
+      </w:r>
+    </w:p>
+    <w:p>
+      <w:r>
+        <w:t xml:space="preserve">orderRepository.save(order); </w:t>
+      </w:r>
+    </w:p>
+    <w:p>
+      <w:r>
+        <w:t xml:space="preserve">productRepository.updateStock(productId, newStock); </w:t>
+      </w:r>
+    </w:p>
+    <w:p>
+      <w:r>
+        <w:t>}</w:t>
+      </w:r>
     </w:p>
     <w:p/>
     <w:p>
@@ -735,250 +572,31 @@
           <w:b/>
           <w:bCs/>
         </w:rPr>
-        <w:t>@Bean</w:t>
-      </w:r>
-      <w:r>
-        <w:t xml:space="preserve"> </w:t>
-      </w:r>
-      <w:r>
-        <w:t xml:space="preserve">Creates a </w:t>
-      </w:r>
-      <w:r>
-        <w:rPr>
-          <w:b/>
-          <w:bCs/>
-        </w:rPr>
-        <w:t>Spring managed object</w:t>
-      </w:r>
-    </w:p>
-    <w:p>
-      <w:pPr>
-        <w:rPr>
-          <w:b/>
-          <w:bCs/>
-        </w:rPr>
-      </w:pPr>
-    </w:p>
-    <w:p>
-      <w:r>
-        <w:rPr>
-          <w:b/>
-          <w:bCs/>
-        </w:rPr>
-        <w:t>@Transactional</w:t>
-      </w:r>
-      <w:r>
-        <w:t xml:space="preserve"> </w:t>
-      </w:r>
-    </w:p>
-    <w:p>
-      <w:r>
-        <w:t xml:space="preserve">public Order </w:t>
-      </w:r>
-      <w:proofErr w:type="spellStart"/>
-      <w:proofErr w:type="gramStart"/>
-      <w:r>
-        <w:t>placeOrder</w:t>
-      </w:r>
-      <w:proofErr w:type="spellEnd"/>
-      <w:r>
-        <w:t>(</w:t>
-      </w:r>
-      <w:proofErr w:type="spellStart"/>
-      <w:proofErr w:type="gramEnd"/>
-      <w:r>
-        <w:t>OrderDto</w:t>
-      </w:r>
-      <w:proofErr w:type="spellEnd"/>
-      <w:r>
-        <w:t xml:space="preserve"> </w:t>
-      </w:r>
-      <w:proofErr w:type="spellStart"/>
-      <w:r>
-        <w:t>dto</w:t>
-      </w:r>
-      <w:proofErr w:type="spellEnd"/>
-      <w:r>
-        <w:t xml:space="preserve">) { </w:t>
-      </w:r>
-    </w:p>
-    <w:p>
-      <w:pPr>
-        <w:rPr>
-          <w:b/>
-          <w:bCs/>
-        </w:rPr>
-      </w:pPr>
-      <w:r>
-        <w:rPr>
-          <w:b/>
-          <w:bCs/>
-        </w:rPr>
-        <w:t xml:space="preserve">// All DB operations here run in one transaction </w:t>
-      </w:r>
-    </w:p>
-    <w:p>
-      <w:pPr>
-        <w:rPr>
-          <w:b/>
-          <w:bCs/>
-        </w:rPr>
-      </w:pPr>
-      <w:r>
-        <w:rPr>
-          <w:b/>
-          <w:bCs/>
-        </w:rPr>
-        <w:t xml:space="preserve">// If anything fails — ALL changes rolled back </w:t>
-      </w:r>
-    </w:p>
-    <w:p>
-      <w:proofErr w:type="spellStart"/>
-      <w:r>
-        <w:t>orderRepository.save</w:t>
-      </w:r>
-      <w:proofErr w:type="spellEnd"/>
-      <w:r>
-        <w:t xml:space="preserve">(order); </w:t>
-      </w:r>
-    </w:p>
-    <w:p>
-      <w:proofErr w:type="spellStart"/>
-      <w:r>
-        <w:t>productRepository.updateStock</w:t>
-      </w:r>
-      <w:proofErr w:type="spellEnd"/>
-      <w:r>
-        <w:t>(</w:t>
-      </w:r>
-      <w:proofErr w:type="spellStart"/>
-      <w:r>
-        <w:t>productId</w:t>
-      </w:r>
-      <w:proofErr w:type="spellEnd"/>
-      <w:r>
-        <w:t xml:space="preserve">, </w:t>
-      </w:r>
-      <w:proofErr w:type="spellStart"/>
-      <w:r>
-        <w:t>newStock</w:t>
-      </w:r>
-      <w:proofErr w:type="spellEnd"/>
-      <w:r>
-        <w:t xml:space="preserve">); </w:t>
-      </w:r>
-    </w:p>
-    <w:p>
-      <w:r>
-        <w:t>}</w:t>
+        <w:t>NestJS equivalent</w:t>
+      </w:r>
+    </w:p>
+    <w:p>
+      <w:r>
+        <w:t>// transaction</w:t>
+      </w:r>
+    </w:p>
+    <w:p>
+      <w:r>
+        <w:t xml:space="preserve"> await this.dataSource.</w:t>
+      </w:r>
+      <w:r>
+        <w:rPr>
+          <w:b/>
+          <w:bCs/>
+        </w:rPr>
+        <w:t>transaction</w:t>
+      </w:r>
+      <w:r>
+        <w:t>(async manager =&gt; { await manager.save(order); await manager.update(Product, productId, { stock }); });</w:t>
       </w:r>
     </w:p>
     <w:p/>
     <w:p>
-      <w:pPr>
-        <w:rPr>
-          <w:b/>
-          <w:bCs/>
-        </w:rPr>
-      </w:pPr>
-      <w:proofErr w:type="spellStart"/>
-      <w:r>
-        <w:rPr>
-          <w:b/>
-          <w:bCs/>
-        </w:rPr>
-        <w:t>NestJS</w:t>
-      </w:r>
-      <w:proofErr w:type="spellEnd"/>
-      <w:r>
-        <w:rPr>
-          <w:b/>
-          <w:bCs/>
-        </w:rPr>
-        <w:t xml:space="preserve"> equivalent</w:t>
-      </w:r>
-    </w:p>
-    <w:p>
-      <w:r>
-        <w:t>// transaction</w:t>
-      </w:r>
-    </w:p>
-    <w:p>
-      <w:r>
-        <w:t xml:space="preserve"> await </w:t>
-      </w:r>
-      <w:proofErr w:type="spellStart"/>
-      <w:proofErr w:type="gramStart"/>
-      <w:r>
-        <w:t>this.dataSource.</w:t>
-      </w:r>
-      <w:r>
-        <w:rPr>
-          <w:b/>
-          <w:bCs/>
-        </w:rPr>
-        <w:t>transaction</w:t>
-      </w:r>
-      <w:proofErr w:type="spellEnd"/>
-      <w:proofErr w:type="gramEnd"/>
-      <w:r>
-        <w:t xml:space="preserve">(async manager =&gt; </w:t>
-      </w:r>
-      <w:proofErr w:type="gramStart"/>
-      <w:r>
-        <w:t>{ await</w:t>
-      </w:r>
-      <w:proofErr w:type="gramEnd"/>
-      <w:r>
-        <w:t xml:space="preserve"> </w:t>
-      </w:r>
-      <w:proofErr w:type="spellStart"/>
-      <w:proofErr w:type="gramStart"/>
-      <w:r>
-        <w:t>manager.save</w:t>
-      </w:r>
-      <w:proofErr w:type="spellEnd"/>
-      <w:proofErr w:type="gramEnd"/>
-      <w:r>
-        <w:t xml:space="preserve">(order); await </w:t>
-      </w:r>
-      <w:proofErr w:type="spellStart"/>
-      <w:proofErr w:type="gramStart"/>
-      <w:r>
-        <w:t>manager.update</w:t>
-      </w:r>
-      <w:proofErr w:type="spellEnd"/>
-      <w:proofErr w:type="gramEnd"/>
-      <w:r>
-        <w:t xml:space="preserve">(Product, </w:t>
-      </w:r>
-      <w:proofErr w:type="spellStart"/>
-      <w:r>
-        <w:t>productId</w:t>
-      </w:r>
-      <w:proofErr w:type="spellEnd"/>
-      <w:r>
-        <w:t xml:space="preserve">, </w:t>
-      </w:r>
-      <w:proofErr w:type="gramStart"/>
-      <w:r>
-        <w:t>{ stock</w:t>
-      </w:r>
-      <w:proofErr w:type="gramEnd"/>
-      <w:r>
-        <w:t xml:space="preserve"> })</w:t>
-      </w:r>
-      <w:proofErr w:type="gramStart"/>
-      <w:r>
-        <w:t>; }</w:t>
-      </w:r>
-      <w:proofErr w:type="gramEnd"/>
-      <w:r>
-        <w:t>);</w:t>
-      </w:r>
-    </w:p>
-    <w:p/>
-    <w:p>
       <w:r>
         <w:rPr>
           <w:b/>
@@ -987,15 +605,7 @@
         <w:t>Annotations</w:t>
       </w:r>
       <w:r>
-        <w:t xml:space="preserve"> are labels that tell Spring Boot how to treat your class, method, or field — same as decorators in </w:t>
-      </w:r>
-      <w:proofErr w:type="spellStart"/>
-      <w:r>
-        <w:t>NestJS</w:t>
-      </w:r>
-      <w:proofErr w:type="spellEnd"/>
-      <w:r>
-        <w:t>, just different syntax.</w:t>
+        <w:t xml:space="preserve"> are labels that tell Spring Boot how to treat your class, method, or field — same as decorators in NestJS, just different syntax.</w:t>
       </w:r>
       <w:r>
         <w:br/>
@@ -1238,15 +848,7 @@
         </w:numPr>
       </w:pPr>
       <w:r>
-        <w:t>@</w:t>
-      </w:r>
-      <w:proofErr w:type="gramStart"/>
-      <w:r>
-        <w:t>Cacheable(</w:t>
-      </w:r>
-      <w:proofErr w:type="gramEnd"/>
-      <w:r>
-        <w:t>value = "users", key = "#id")</w:t>
+        <w:t>@Cacheable(value = "users", key = "#id")</w:t>
       </w:r>
     </w:p>
     <w:p>
@@ -1268,23 +870,7 @@
         </w:numPr>
       </w:pPr>
       <w:r>
-        <w:t>@</w:t>
-      </w:r>
-      <w:proofErr w:type="gramStart"/>
-      <w:r>
-        <w:t>Cacheable(</w:t>
-      </w:r>
-      <w:proofErr w:type="gramEnd"/>
-      <w:r>
-        <w:t>value = "users", key = "#</w:t>
-      </w:r>
-      <w:proofErr w:type="spellStart"/>
-      <w:r>
-        <w:t>firstName</w:t>
-      </w:r>
-      <w:proofErr w:type="spellEnd"/>
-      <w:r>
-        <w:t xml:space="preserve"> + '-' + #lastName")</w:t>
+        <w:t>@Cacheable(value = "users", key = "#firstName + '-' + #lastName")</w:t>
       </w:r>
     </w:p>
     <w:p>
@@ -1327,15 +913,7 @@
         </w:numPr>
       </w:pPr>
       <w:r>
-        <w:t>@</w:t>
-      </w:r>
-      <w:proofErr w:type="gramStart"/>
-      <w:r>
-        <w:t>Cacheable(</w:t>
-      </w:r>
-      <w:proofErr w:type="gramEnd"/>
-      <w:r>
-        <w:t>value = "users", condition = "#id &gt; 10")</w:t>
+        <w:t>@Cacheable(value = "users", condition = "#id &gt; 10")</w:t>
       </w:r>
     </w:p>
     <w:p>
@@ -1389,15 +967,7 @@
         </w:numPr>
       </w:pPr>
       <w:r>
-        <w:t>@</w:t>
-      </w:r>
-      <w:proofErr w:type="gramStart"/>
-      <w:r>
-        <w:t>Cacheable(</w:t>
-      </w:r>
-      <w:proofErr w:type="gramEnd"/>
-      <w:r>
-        <w:t>value = "users", unless = "#result == null")</w:t>
+        <w:t>@Cacheable(value = "users", unless = "#result == null")</w:t>
       </w:r>
     </w:p>
     <w:p>
@@ -1566,44 +1136,15 @@
         </w:numPr>
       </w:pPr>
       <w:r>
-        <w:t>@</w:t>
-      </w:r>
-      <w:proofErr w:type="gramStart"/>
-      <w:r>
-        <w:t>CacheEvict(</w:t>
-      </w:r>
-      <w:proofErr w:type="gramEnd"/>
-      <w:r>
-        <w:t>value = "users", key = "#id")</w:t>
-      </w:r>
-      <w:r>
-        <w:br/>
-        <w:t xml:space="preserve">public void </w:t>
-      </w:r>
-      <w:proofErr w:type="spellStart"/>
-      <w:proofErr w:type="gramStart"/>
-      <w:r>
-        <w:t>deleteUser</w:t>
-      </w:r>
-      <w:proofErr w:type="spellEnd"/>
-      <w:r>
-        <w:t>(</w:t>
-      </w:r>
-      <w:proofErr w:type="gramEnd"/>
-      <w:r>
-        <w:t>Long id) {</w:t>
-      </w:r>
-      <w:r>
-        <w:br/>
-        <w:t xml:space="preserve">    </w:t>
-      </w:r>
-      <w:proofErr w:type="spellStart"/>
-      <w:r>
-        <w:t>userRepository.deleteById</w:t>
-      </w:r>
-      <w:proofErr w:type="spellEnd"/>
-      <w:r>
-        <w:t>(id);</w:t>
+        <w:t>@CacheEvict(value = "users", key = "#id")</w:t>
+      </w:r>
+      <w:r>
+        <w:br/>
+        <w:t>public void deleteUser(Long id) {</w:t>
+      </w:r>
+      <w:r>
+        <w:br/>
+        <w:t xml:space="preserve">    userRepository.deleteById(id);</w:t>
       </w:r>
       <w:r>
         <w:br/>
@@ -1680,13 +1221,8 @@
           <w:numId w:val="3"/>
         </w:numPr>
       </w:pPr>
-      <w:proofErr w:type="spellStart"/>
-      <w:r>
-        <w:t>EhCache</w:t>
-      </w:r>
-      <w:proofErr w:type="spellEnd"/>
-      <w:r>
-        <w:t xml:space="preserve"> </w:t>
+      <w:r>
+        <w:t xml:space="preserve">EhCache </w:t>
       </w:r>
     </w:p>
     <w:p>
@@ -1830,61 +1366,16 @@
       </w:r>
     </w:p>
     <w:p>
-      <w:proofErr w:type="spellStart"/>
-      <w:proofErr w:type="gramStart"/>
-      <w:r>
-        <w:t>spring.cache</w:t>
-      </w:r>
-      <w:proofErr w:type="gramEnd"/>
-      <w:r>
-        <w:t>.type</w:t>
-      </w:r>
-      <w:proofErr w:type="spellEnd"/>
-      <w:r>
-        <w:t>=</w:t>
-      </w:r>
-      <w:proofErr w:type="spellStart"/>
-      <w:r>
-        <w:t>redis</w:t>
-      </w:r>
-      <w:proofErr w:type="spellEnd"/>
-      <w:r>
-        <w:br/>
-      </w:r>
-      <w:proofErr w:type="spellStart"/>
-      <w:r>
-        <w:t>spring.</w:t>
-      </w:r>
-      <w:proofErr w:type="gramStart"/>
-      <w:r>
-        <w:t>data.redis</w:t>
-      </w:r>
-      <w:proofErr w:type="gramEnd"/>
-      <w:r>
-        <w:t>.host</w:t>
-      </w:r>
-      <w:proofErr w:type="spellEnd"/>
-      <w:r>
-        <w:t>=localhost</w:t>
-      </w:r>
-      <w:r>
-        <w:br/>
-      </w:r>
-      <w:proofErr w:type="spellStart"/>
-      <w:r>
-        <w:t>spring.</w:t>
-      </w:r>
-      <w:proofErr w:type="gramStart"/>
-      <w:r>
-        <w:t>data.redis</w:t>
-      </w:r>
-      <w:proofErr w:type="gramEnd"/>
-      <w:r>
-        <w:t>.port</w:t>
-      </w:r>
-      <w:proofErr w:type="spellEnd"/>
-      <w:r>
-        <w:t>=6379</w:t>
+      <w:r>
+        <w:t>spring.cache.type=redis</w:t>
+      </w:r>
+      <w:r>
+        <w:br/>
+        <w:t>spring.data.redis.host=localhost</w:t>
+      </w:r>
+      <w:r>
+        <w:br/>
+        <w:t>spring.data.redis.port=6379</w:t>
       </w:r>
     </w:p>
     <w:p>
@@ -1964,40 +1455,12 @@
       </w:r>
     </w:p>
     <w:p>
-      <w:proofErr w:type="spellStart"/>
-      <w:r>
-        <w:t>redisTemplate.opsForValue</w:t>
-      </w:r>
-      <w:proofErr w:type="spellEnd"/>
-      <w:r>
-        <w:t>(</w:t>
-      </w:r>
-      <w:proofErr w:type="gramStart"/>
-      <w:r>
-        <w:t>).set</w:t>
-      </w:r>
-      <w:proofErr w:type="gramEnd"/>
-      <w:r>
-        <w:t>(...);</w:t>
-      </w:r>
-      <w:r>
-        <w:br/>
-      </w:r>
-      <w:proofErr w:type="spellStart"/>
-      <w:r>
-        <w:t>redisTemplate.opsForValue</w:t>
-      </w:r>
-      <w:proofErr w:type="spellEnd"/>
-      <w:r>
-        <w:t>(</w:t>
-      </w:r>
-      <w:proofErr w:type="gramStart"/>
-      <w:r>
-        <w:t>).get</w:t>
-      </w:r>
-      <w:proofErr w:type="gramEnd"/>
-      <w:r>
-        <w:t>(...);</w:t>
+      <w:r>
+        <w:t>redisTemplate.opsForValue().set(...);</w:t>
+      </w:r>
+      <w:r>
+        <w:br/>
+        <w:t>redisTemplate.opsForValue().get(...);</w:t>
       </w:r>
     </w:p>
     <w:p/>
@@ -2027,43 +1490,14 @@
     </w:p>
     <w:p>
       <w:r>
-        <w:t xml:space="preserve">Product cached = </w:t>
-      </w:r>
-      <w:proofErr w:type="spellStart"/>
-      <w:proofErr w:type="gramStart"/>
-      <w:r>
-        <w:t>redis.get</w:t>
-      </w:r>
-      <w:proofErr w:type="spellEnd"/>
-      <w:r>
-        <w:t>(</w:t>
-      </w:r>
-      <w:proofErr w:type="gramEnd"/>
-      <w:r>
-        <w:t>"</w:t>
-      </w:r>
-      <w:proofErr w:type="gramStart"/>
-      <w:r>
-        <w:t>products::</w:t>
-      </w:r>
-      <w:proofErr w:type="gramEnd"/>
-      <w:r>
-        <w:t>1");</w:t>
-      </w:r>
-      <w:r>
-        <w:br/>
-      </w:r>
-      <w:r>
-        <w:br/>
-        <w:t>if (</w:t>
-      </w:r>
-      <w:proofErr w:type="gramStart"/>
-      <w:r>
-        <w:t>cached !</w:t>
-      </w:r>
-      <w:proofErr w:type="gramEnd"/>
-      <w:r>
-        <w:t>= null) {</w:t>
+        <w:t>Product cached = redis.get("products::1");</w:t>
+      </w:r>
+      <w:r>
+        <w:br/>
+      </w:r>
+      <w:r>
+        <w:br/>
+        <w:t>if (cached != null) {</w:t>
       </w:r>
       <w:r>
         <w:br/>
@@ -2078,47 +1512,11 @@
       </w:r>
       <w:r>
         <w:br/>
-        <w:t xml:space="preserve">Product </w:t>
-      </w:r>
-      <w:proofErr w:type="spellStart"/>
-      <w:r>
-        <w:t>product</w:t>
-      </w:r>
-      <w:proofErr w:type="spellEnd"/>
-      <w:r>
-        <w:t xml:space="preserve"> = </w:t>
-      </w:r>
-      <w:proofErr w:type="spellStart"/>
-      <w:r>
-        <w:t>productRepository.findById</w:t>
-      </w:r>
-      <w:proofErr w:type="spellEnd"/>
-      <w:r>
-        <w:t>(1L);</w:t>
-      </w:r>
-      <w:r>
-        <w:br/>
-      </w:r>
-      <w:proofErr w:type="spellStart"/>
-      <w:proofErr w:type="gramStart"/>
-      <w:r>
-        <w:t>redis.set</w:t>
-      </w:r>
-      <w:proofErr w:type="spellEnd"/>
-      <w:r>
-        <w:t>(</w:t>
-      </w:r>
-      <w:proofErr w:type="gramEnd"/>
-      <w:r>
-        <w:t>"</w:t>
-      </w:r>
-      <w:proofErr w:type="gramStart"/>
-      <w:r>
-        <w:t>products::</w:t>
-      </w:r>
-      <w:proofErr w:type="gramEnd"/>
-      <w:r>
-        <w:t>1", product);</w:t>
+        <w:t>Product product = productRepository.findById(1L);</w:t>
+      </w:r>
+      <w:r>
+        <w:br/>
+        <w:t>redis.set("products::1", product);</w:t>
       </w:r>
       <w:r>
         <w:br/>
@@ -2135,15 +1533,7 @@
     </w:p>
     <w:p>
       <w:r>
-        <w:t>@</w:t>
-      </w:r>
-      <w:proofErr w:type="gramStart"/>
-      <w:r>
-        <w:t>Cacheable(</w:t>
-      </w:r>
-      <w:proofErr w:type="gramEnd"/>
-      <w:r>
-        <w:t>value = "products", key = "#id")</w:t>
+        <w:t>@Cacheable(value = "products", key = "#id")</w:t>
       </w:r>
     </w:p>
     <w:p>
@@ -2188,15 +1578,7 @@
     </w:p>
     <w:p>
       <w:r>
-        <w:t xml:space="preserve">@Scheduled is a Spring annotation used to execute methods automatically at fixed intervals, fixed delays, or specific times using </w:t>
-      </w:r>
-      <w:proofErr w:type="spellStart"/>
-      <w:r>
-        <w:t>cron</w:t>
-      </w:r>
-      <w:proofErr w:type="spellEnd"/>
-      <w:r>
-        <w:t xml:space="preserve"> expressions. It is commonly used for background jobs such as cache cleanup, report generation, email notifications, and periodic data synchronization</w:t>
+        <w:t>@Scheduled is a Spring annotation used to execute methods automatically at fixed intervals, fixed delays, or specific times using cron expressions. It is commonly used for background jobs such as cache cleanup, report generation, email notifications, and periodic data synchronization</w:t>
       </w:r>
     </w:p>
     <w:p>
@@ -2291,18 +1673,8 @@
             <w:hideMark/>
           </w:tcPr>
           <w:p>
-            <w:proofErr w:type="spellStart"/>
-            <w:proofErr w:type="gramStart"/>
             <w:r>
-              <w:t>setTimeout</w:t>
-            </w:r>
-            <w:proofErr w:type="spellEnd"/>
-            <w:r>
-              <w:t>(</w:t>
-            </w:r>
-            <w:proofErr w:type="gramEnd"/>
-            <w:r>
-              <w:t>)</w:t>
+              <w:t>setTimeout()</w:t>
             </w:r>
           </w:p>
         </w:tc>
@@ -2314,62 +1686,7 @@
           </w:tcPr>
           <w:p>
             <w:r>
-              <w:t>@</w:t>
-            </w:r>
-            <w:proofErr w:type="gramStart"/>
-            <w:r>
-              <w:t>Scheduled(</w:t>
-            </w:r>
-            <w:proofErr w:type="gramEnd"/>
-            <w:r>
-              <w:t>initialDelay = ...)</w:t>
-            </w:r>
-          </w:p>
-        </w:tc>
-      </w:tr>
-      <w:tr>
-        <w:trPr>
-          <w:tblCellSpacing w:w="15" w:type="dxa"/>
-        </w:trPr>
-        <w:tc>
-          <w:tcPr>
-            <w:tcW w:w="0" w:type="auto"/>
-            <w:vAlign w:val="center"/>
-            <w:hideMark/>
-          </w:tcPr>
-          <w:p>
-            <w:proofErr w:type="spellStart"/>
-            <w:proofErr w:type="gramStart"/>
-            <w:r>
-              <w:t>setInterval</w:t>
-            </w:r>
-            <w:proofErr w:type="spellEnd"/>
-            <w:r>
-              <w:t>(</w:t>
-            </w:r>
-            <w:proofErr w:type="gramEnd"/>
-            <w:r>
-              <w:t>)</w:t>
-            </w:r>
-          </w:p>
-        </w:tc>
-        <w:tc>
-          <w:tcPr>
-            <w:tcW w:w="0" w:type="auto"/>
-            <w:vAlign w:val="center"/>
-            <w:hideMark/>
-          </w:tcPr>
-          <w:p>
-            <w:r>
-              <w:t>@</w:t>
-            </w:r>
-            <w:proofErr w:type="gramStart"/>
-            <w:r>
-              <w:t>Scheduled(</w:t>
-            </w:r>
-            <w:proofErr w:type="gramEnd"/>
-            <w:r>
-              <w:t>fixedRate = ...)</w:t>
+              <w:t>@Scheduled(initialDelay = ...)</w:t>
             </w:r>
           </w:p>
         </w:tc>
@@ -2386,15 +1703,7 @@
           </w:tcPr>
           <w:p>
             <w:r>
-              <w:t>Cron libraries (node-</w:t>
-            </w:r>
-            <w:proofErr w:type="spellStart"/>
-            <w:r>
-              <w:t>cron</w:t>
-            </w:r>
-            <w:proofErr w:type="spellEnd"/>
-            <w:r>
-              <w:t>)</w:t>
+              <w:t>setInterval()</w:t>
             </w:r>
           </w:p>
         </w:tc>
@@ -2406,15 +1715,36 @@
           </w:tcPr>
           <w:p>
             <w:r>
-              <w:t>@</w:t>
+              <w:t>@Scheduled(fixedRate = ...)</w:t>
             </w:r>
-            <w:proofErr w:type="gramStart"/>
+          </w:p>
+        </w:tc>
+      </w:tr>
+      <w:tr>
+        <w:trPr>
+          <w:tblCellSpacing w:w="15" w:type="dxa"/>
+        </w:trPr>
+        <w:tc>
+          <w:tcPr>
+            <w:tcW w:w="0" w:type="auto"/>
+            <w:vAlign w:val="center"/>
+            <w:hideMark/>
+          </w:tcPr>
+          <w:p>
             <w:r>
-              <w:t>Scheduled(</w:t>
+              <w:t>Cron libraries (node-cron)</w:t>
             </w:r>
-            <w:proofErr w:type="gramEnd"/>
+          </w:p>
+        </w:tc>
+        <w:tc>
+          <w:tcPr>
+            <w:tcW w:w="0" w:type="auto"/>
+            <w:vAlign w:val="center"/>
+            <w:hideMark/>
+          </w:tcPr>
+          <w:p>
             <w:r>
-              <w:t>cron = "...")</w:t>
+              <w:t>@Scheduled(cron = "...")</w:t>
             </w:r>
           </w:p>
         </w:tc>
@@ -2454,66 +1784,19 @@
       </w:r>
       <w:r>
         <w:br/>
-        <w:t xml:space="preserve">    public static void </w:t>
-      </w:r>
-      <w:proofErr w:type="gramStart"/>
-      <w:r>
-        <w:t>main(String[</w:t>
-      </w:r>
-      <w:proofErr w:type="gramEnd"/>
-      <w:r>
-        <w:t xml:space="preserve">] </w:t>
-      </w:r>
-      <w:proofErr w:type="spellStart"/>
-      <w:r>
-        <w:t>args</w:t>
-      </w:r>
-      <w:proofErr w:type="spellEnd"/>
-      <w:r>
-        <w:t>) {</w:t>
-      </w:r>
-      <w:r>
-        <w:br/>
-        <w:t xml:space="preserve">        </w:t>
-      </w:r>
-      <w:proofErr w:type="spellStart"/>
-      <w:proofErr w:type="gramStart"/>
-      <w:r>
-        <w:t>SpringApplication.run</w:t>
-      </w:r>
-      <w:proofErr w:type="spellEnd"/>
-      <w:r>
-        <w:t>(</w:t>
-      </w:r>
-      <w:proofErr w:type="spellStart"/>
-      <w:proofErr w:type="gramEnd"/>
-      <w:r>
-        <w:t>Application.class</w:t>
-      </w:r>
-      <w:proofErr w:type="spellEnd"/>
-      <w:r>
-        <w:t xml:space="preserve">, </w:t>
-      </w:r>
-      <w:proofErr w:type="spellStart"/>
-      <w:r>
-        <w:t>args</w:t>
-      </w:r>
-      <w:proofErr w:type="spellEnd"/>
-      <w:r>
-        <w:t>);</w:t>
+        <w:t xml:space="preserve">    public static void main(String[] args) {</w:t>
+      </w:r>
+      <w:r>
+        <w:br/>
+        <w:t xml:space="preserve">        SpringApplication.run(Application.class, args);</w:t>
       </w:r>
       <w:r>
         <w:br/>
       </w:r>
       <w:r>
         <w:lastRenderedPageBreak/>
-        <w:t xml:space="preserve">  </w:t>
-      </w:r>
-      <w:proofErr w:type="gramStart"/>
-      <w:r>
-        <w:t xml:space="preserve">  }</w:t>
-      </w:r>
-      <w:proofErr w:type="gramEnd"/>
+        <w:t xml:space="preserve">    }</w:t>
+      </w:r>
       <w:r>
         <w:br/>
         <w:t>}</w:t>
@@ -2549,69 +1832,27 @@
       </w:r>
       <w:r>
         <w:br/>
-        <w:t xml:space="preserve">public class </w:t>
-      </w:r>
-      <w:proofErr w:type="spellStart"/>
-      <w:r>
-        <w:t>MyScheduler</w:t>
-      </w:r>
-      <w:proofErr w:type="spellEnd"/>
-      <w:r>
-        <w:t xml:space="preserve"> {</w:t>
-      </w:r>
-      <w:r>
-        <w:br/>
-      </w:r>
-      <w:r>
-        <w:br/>
-        <w:t xml:space="preserve">    @</w:t>
-      </w:r>
-      <w:proofErr w:type="gramStart"/>
-      <w:r>
-        <w:t>Scheduled(</w:t>
-      </w:r>
-      <w:proofErr w:type="gramEnd"/>
-      <w:r>
-        <w:t>fixedRate = 5000)</w:t>
-      </w:r>
-      <w:r>
-        <w:br/>
-        <w:t xml:space="preserve">    public void </w:t>
-      </w:r>
-      <w:proofErr w:type="spellStart"/>
-      <w:proofErr w:type="gramStart"/>
-      <w:r>
-        <w:t>runTask</w:t>
-      </w:r>
-      <w:proofErr w:type="spellEnd"/>
-      <w:r>
-        <w:t>(</w:t>
-      </w:r>
-      <w:proofErr w:type="gramEnd"/>
-      <w:r>
-        <w:t>) {</w:t>
-      </w:r>
-      <w:r>
-        <w:br/>
-        <w:t xml:space="preserve">        </w:t>
-      </w:r>
-      <w:proofErr w:type="spellStart"/>
-      <w:r>
-        <w:t>System.out.println</w:t>
-      </w:r>
-      <w:proofErr w:type="spellEnd"/>
-      <w:r>
-        <w:t>("Running every 5 seconds");</w:t>
-      </w:r>
-      <w:r>
-        <w:br/>
-        <w:t xml:space="preserve">  </w:t>
-      </w:r>
-      <w:proofErr w:type="gramStart"/>
-      <w:r>
-        <w:t xml:space="preserve">  }</w:t>
-      </w:r>
-      <w:proofErr w:type="gramEnd"/>
+        <w:t>public class MyScheduler {</w:t>
+      </w:r>
+      <w:r>
+        <w:br/>
+      </w:r>
+      <w:r>
+        <w:br/>
+        <w:t xml:space="preserve">    @Scheduled(fixedRate = 5000)</w:t>
+      </w:r>
+      <w:r>
+        <w:br/>
+        <w:t xml:space="preserve">    public void runTask() {</w:t>
+      </w:r>
+      <w:r>
+        <w:br/>
+        <w:t xml:space="preserve">        System.out.println("Running every 5 seconds");</w:t>
+      </w:r>
+      <w:r>
+        <w:br/>
+        <w:t xml:space="preserve">    }</w:t>
+      </w:r>
       <w:r>
         <w:br/>
         <w:t>}</w:t>
@@ -2637,32 +1878,11 @@
     </w:p>
     <w:p>
       <w:r>
-        <w:t>@</w:t>
-      </w:r>
-      <w:proofErr w:type="gramStart"/>
-      <w:r>
-        <w:t>Scheduled(</w:t>
-      </w:r>
-      <w:proofErr w:type="gramEnd"/>
-      <w:r>
-        <w:t>cron = "0 0 9 * * *")</w:t>
-      </w:r>
-      <w:r>
-        <w:br/>
-        <w:t xml:space="preserve">public void </w:t>
-      </w:r>
-      <w:proofErr w:type="spellStart"/>
-      <w:proofErr w:type="gramStart"/>
-      <w:r>
-        <w:t>sendDailyReport</w:t>
-      </w:r>
-      <w:proofErr w:type="spellEnd"/>
-      <w:r>
-        <w:t>(</w:t>
-      </w:r>
-      <w:proofErr w:type="gramEnd"/>
-      <w:r>
-        <w:t>) {</w:t>
+        <w:t>@Scheduled(cron = "0 0 9 * * *")</w:t>
+      </w:r>
+      <w:r>
+        <w:br/>
+        <w:t>public void sendDailyReport() {</w:t>
       </w:r>
       <w:r>
         <w:br/>
@@ -2686,36 +1906,15 @@
     </w:p>
     <w:p>
       <w:r>
-        <w:t>@</w:t>
-      </w:r>
-      <w:proofErr w:type="gramStart"/>
-      <w:r>
-        <w:t>Scheduled(</w:t>
-      </w:r>
-      <w:proofErr w:type="gramEnd"/>
-      <w:r>
-        <w:br/>
-        <w:t xml:space="preserve">    </w:t>
-      </w:r>
-      <w:proofErr w:type="spellStart"/>
-      <w:r>
-        <w:t>fixedRate</w:t>
-      </w:r>
-      <w:proofErr w:type="spellEnd"/>
-      <w:r>
-        <w:t xml:space="preserve"> = 5000,</w:t>
-      </w:r>
-      <w:r>
-        <w:br/>
-        <w:t xml:space="preserve">    </w:t>
-      </w:r>
-      <w:proofErr w:type="spellStart"/>
-      <w:r>
-        <w:t>initialDelay</w:t>
-      </w:r>
-      <w:proofErr w:type="spellEnd"/>
-      <w:r>
-        <w:t xml:space="preserve"> = 10000</w:t>
+        <w:t>@Scheduled(</w:t>
+      </w:r>
+      <w:r>
+        <w:br/>
+        <w:t xml:space="preserve">    fixedRate = 5000,</w:t>
+      </w:r>
+      <w:r>
+        <w:br/>
+        <w:t xml:space="preserve">    initialDelay = 10000</w:t>
       </w:r>
       <w:r>
         <w:br/>
@@ -2843,15 +2042,7 @@
     </w:p>
     <w:p>
       <w:r>
-        <w:t xml:space="preserve">public class </w:t>
-      </w:r>
-      <w:proofErr w:type="spellStart"/>
-      <w:r>
-        <w:t>JwtService</w:t>
-      </w:r>
-      <w:proofErr w:type="spellEnd"/>
-      <w:r>
-        <w:t xml:space="preserve"> {</w:t>
+        <w:t>public class JwtService {</w:t>
       </w:r>
     </w:p>
     <w:p/>
@@ -2862,15 +2053,7 @@
     </w:p>
     <w:p>
       <w:r>
-        <w:t xml:space="preserve">  private String </w:t>
-      </w:r>
-      <w:proofErr w:type="spellStart"/>
-      <w:r>
-        <w:t>jwtSecret</w:t>
-      </w:r>
-      <w:proofErr w:type="spellEnd"/>
-      <w:r>
-        <w:t>;</w:t>
+        <w:t xml:space="preserve">  private String jwtSecret;</w:t>
       </w:r>
     </w:p>
     <w:p/>
@@ -2881,15 +2064,7 @@
     </w:p>
     <w:p>
       <w:r>
-        <w:t xml:space="preserve">  private String </w:t>
-      </w:r>
-      <w:proofErr w:type="spellStart"/>
-      <w:r>
-        <w:t>jwtExpiresIn</w:t>
-      </w:r>
-      <w:proofErr w:type="spellEnd"/>
-      <w:r>
-        <w:t>;</w:t>
+        <w:t xml:space="preserve">  private String jwtExpiresIn;</w:t>
       </w:r>
     </w:p>
     <w:p>
@@ -2914,33 +2089,13 @@
       <w:r>
         <w:t xml:space="preserve"> </w:t>
       </w:r>
-      <w:proofErr w:type="spellStart"/>
-      <w:proofErr w:type="gramStart"/>
-      <w:r>
-        <w:rPr>
-          <w:b/>
-          <w:bCs/>
-        </w:rPr>
-        <w:t>application.properties</w:t>
-      </w:r>
-      <w:proofErr w:type="spellEnd"/>
-      <w:proofErr w:type="gramEnd"/>
-      <w:r>
-        <w:rPr>
-          <w:b/>
-          <w:bCs/>
-        </w:rPr>
-        <w:t xml:space="preserve"> </w:t>
-      </w:r>
-      <w:proofErr w:type="gramStart"/>
-      <w:r>
-        <w:rPr>
-          <w:b/>
-          <w:bCs/>
-        </w:rPr>
-        <w:t>or .env</w:t>
-      </w:r>
-      <w:proofErr w:type="gramEnd"/>
+      <w:r>
+        <w:rPr>
+          <w:b/>
+          <w:bCs/>
+        </w:rPr>
+        <w:t>application.properties or .env</w:t>
+      </w:r>
     </w:p>
     <w:p>
       <w:pPr>
@@ -2950,44 +2105,22 @@
         </w:numPr>
       </w:pPr>
       <w:r>
-        <w:t xml:space="preserve">Like </w:t>
-      </w:r>
-      <w:proofErr w:type="spellStart"/>
-      <w:r>
-        <w:t>configService.get</w:t>
-      </w:r>
-      <w:proofErr w:type="spellEnd"/>
-      <w:r>
-        <w:t xml:space="preserve">('JWT_SECRET') in </w:t>
-      </w:r>
-      <w:proofErr w:type="spellStart"/>
-      <w:r>
-        <w:t>NestJS</w:t>
-      </w:r>
-      <w:proofErr w:type="spellEnd"/>
-    </w:p>
-    <w:p>
-      <w:pPr>
-        <w:rPr>
-          <w:b/>
-          <w:bCs/>
-        </w:rPr>
-      </w:pPr>
-      <w:proofErr w:type="spellStart"/>
-      <w:r>
-        <w:rPr>
-          <w:b/>
-          <w:bCs/>
-        </w:rPr>
-        <w:t>NestJS</w:t>
-      </w:r>
-      <w:proofErr w:type="spellEnd"/>
-      <w:r>
-        <w:rPr>
-          <w:b/>
-          <w:bCs/>
-        </w:rPr>
-        <w:t xml:space="preserve"> equivalent —</w:t>
+        <w:t>Like configService.get('JWT_SECRET') in NestJS</w:t>
+      </w:r>
+    </w:p>
+    <w:p>
+      <w:pPr>
+        <w:rPr>
+          <w:b/>
+          <w:bCs/>
+        </w:rPr>
+      </w:pPr>
+      <w:r>
+        <w:rPr>
+          <w:b/>
+          <w:bCs/>
+        </w:rPr>
+        <w:t>NestJS equivalent —</w:t>
       </w:r>
     </w:p>
     <w:p>
@@ -2996,42 +2129,13 @@
       </w:r>
     </w:p>
     <w:p>
-      <w:proofErr w:type="gramStart"/>
-      <w:r>
-        <w:t>constructor(</w:t>
-      </w:r>
-      <w:proofErr w:type="gramEnd"/>
-      <w:r>
-        <w:t xml:space="preserve">private </w:t>
-      </w:r>
-      <w:proofErr w:type="spellStart"/>
-      <w:r>
-        <w:t>configService</w:t>
-      </w:r>
-      <w:proofErr w:type="spellEnd"/>
-      <w:r>
-        <w:t xml:space="preserve">: </w:t>
-      </w:r>
-      <w:proofErr w:type="spellStart"/>
-      <w:r>
-        <w:t>ConfigService</w:t>
-      </w:r>
-      <w:proofErr w:type="spellEnd"/>
-      <w:r>
-        <w:t>) {}</w:t>
-      </w:r>
-    </w:p>
-    <w:p>
-      <w:r>
-        <w:t xml:space="preserve">// </w:t>
-      </w:r>
-      <w:proofErr w:type="spellStart"/>
-      <w:r>
-        <w:t>configService.get</w:t>
-      </w:r>
-      <w:proofErr w:type="spellEnd"/>
-      <w:r>
-        <w:t>('JWT_SECRET')</w:t>
+      <w:r>
+        <w:t>constructor(private configService: ConfigService) {}</w:t>
+      </w:r>
+    </w:p>
+    <w:p>
+      <w:r>
+        <w:t>// configService.get('JWT_SECRET')</w:t>
       </w:r>
       <w:r>
         <w:br/>
@@ -3047,41 +2151,7 @@
         <w:t>Project Lombok</w:t>
       </w:r>
       <w:r>
-        <w:t xml:space="preserve"> is a popular Java library that eliminates boilerplate code (like getters, setters, </w:t>
-      </w:r>
-      <w:proofErr w:type="gramStart"/>
-      <w:r>
-        <w:t>equals(</w:t>
-      </w:r>
-      <w:proofErr w:type="gramEnd"/>
-      <w:r>
-        <w:t xml:space="preserve">), </w:t>
-      </w:r>
-      <w:proofErr w:type="spellStart"/>
-      <w:proofErr w:type="gramStart"/>
-      <w:r>
-        <w:t>hashCode</w:t>
-      </w:r>
-      <w:proofErr w:type="spellEnd"/>
-      <w:r>
-        <w:t>(</w:t>
-      </w:r>
-      <w:proofErr w:type="gramEnd"/>
-      <w:r>
-        <w:t xml:space="preserve">), and </w:t>
-      </w:r>
-      <w:proofErr w:type="spellStart"/>
-      <w:proofErr w:type="gramStart"/>
-      <w:r>
-        <w:t>toString</w:t>
-      </w:r>
-      <w:proofErr w:type="spellEnd"/>
-      <w:r>
-        <w:t>(</w:t>
-      </w:r>
-      <w:proofErr w:type="gramEnd"/>
-      <w:r>
-        <w:t>)) by automatically generating it at compile-time using simple annotations. It improves code readability and saves time, though it requires specific IDE plugin support. [</w:t>
+        <w:t xml:space="preserve"> is a popular Java library that eliminates boilerplate code (like getters, setters, equals(), hashCode(), and toString()) by automatically generating it at compile-time using simple annotations. It improves code readability and saves time, though it requires specific IDE plugin support. [</w:t>
       </w:r>
       <w:hyperlink r:id="rId5" w:history="1">
         <w:r>
@@ -3117,7 +2187,21 @@
         <w:t>]</w:t>
       </w:r>
     </w:p>
-    <w:p/>
+    <w:p>
+      <w:r>
+        <w:br/>
+      </w:r>
+      <w:r>
+        <w:br/>
+      </w:r>
+      <w:r>
+        <w:rPr>
+          <w:b/>
+          <w:bCs/>
+        </w:rPr>
+        <w:t>JPQL (Java Persistence Query Language)</w:t>
+      </w:r>
+    </w:p>
     <w:p/>
     <w:p/>
     <w:p/>

</xml_diff>